<commit_message>
Add output da pesquisa tintas e pigmentos (PDF,TeX, DOCX e auxiliares)
Co-Authored-By: Claude Opus 4.6 <noreply@anthropic.com>
</commit_message>
<xml_diff>
--- a/output/pesquisa-tintas-pigmentos-brasil.docx
+++ b/output/pesquisa-tintas-pigmentos-brasil.docx
@@ -229,27 +229,41 @@
     <w:p>
       <w:pPr>
         <w:pStyle w:val="BlockText"/>
-      </w:pPr>
-      <w:r>
-        <w:t xml:space="preserve">[Parágrafo único com: objetivos, metodologia, resultados e conclusões. Verbo na 3ª pessoa do singular.]</w:t>
+        <w:spacing w:line="360" w:lineRule="auto" w:before="0" w:after="0"/>
+        <w:ind w:firstLine="709"/>
+        <w:jc w:val="both"/>
+      </w:pPr>
+      <w:r>
+        <w:rPr>
+          <w:rFonts w:ascii="Times New Roman" w:hAnsi="Times New Roman"/>
+          <w:b w:val="0"/>
+          <w:sz w:val="24"/>
+        </w:rPr>
+        <w:t>O presente trabalho tem como objetivo analisar a indústria brasileira de tintas e pigmentos na perspectiva da indústria de transformação, identificando os nichos produtivos, as matérias-primas empregadas e os processos de fabricação característicos de cada segmento. A metodologia adotada consiste em pesquisa bibliográfica e documental, com base em dados setoriais da ABRAFATI, do Instituto Brasileiro de Geografia e Estatística (IBGE/PIA-Empresa), de relatórios de mercado da Grand View Research e da Mordor Intelligence, além de fontes técnicas especializadas. Os resultados indicam que o Brasil ocupa a 4ª posição no ranking mundial de produção de tintas, com 2,005 bilhões de litros produzidos em 2025, inserindo-se em um mercado global avaliado em USD 211,28 bilhões em 2024. O setor estrutura-se como elo intermediário entre as indústrias de base — petroquímica, mineração e química fina — e as indústrias usuárias, sendo classificado na Divisão 20 da CNAE 2.0. A formulação de tintas envolve quatro famílias de matérias-primas — resinas, pigmentos, solventes e aditivos — cujas combinações determinam os nichos produtivos identificados: imobiliário, industrial geral, automotivo, naval, tintas em pó, sistemas de cura UV/EB e tintas especiais e funcionais. Os processos de fabricação variam conforme o nicho, com destaque para a dispersão de pigmentos em moinhos de pérolas, a extrusão para tintas em pó e a fotopolimerização para sistemas de cura por radiação. Conclui-se que o setor apresenta elevado potencial de diversificação, com nichos estratégicos de alta oportunidade em anticorrosivos para o segmento offshore, tintas intumescentes, revestimentos para energias renováveis e sistemas base água, tendência impulsionada por regulamentações ambientais e pela crescente demanda ESG.</w:t>
       </w:r>
     </w:p>
     <w:p>
       <w:pPr>
         <w:pStyle w:val="BlockText"/>
+        <w:spacing w:line="360" w:lineRule="auto" w:before="0" w:after="0"/>
+        <w:ind w:firstLine="0"/>
+        <w:jc w:val="both"/>
       </w:pPr>
       <w:r>
         <w:rPr>
+          <w:rFonts w:ascii="Times New Roman" w:hAnsi="Times New Roman"/>
           <w:b/>
-          <w:bCs/>
+          <w:sz w:val="24"/>
         </w:rPr>
-        <w:t xml:space="preserve">Palavras-chave:</w:t>
-      </w:r>
-      <w:r>
-        <w:t xml:space="preserve"> </w:t>
-      </w:r>
-      <w:r>
-        <w:t xml:space="preserve">[palavra 1]; [palavra 2]; [palavra 3]; [palavra 4]; [palavra 5].</w:t>
+        <w:t xml:space="preserve">Palavras-chave: </w:t>
+      </w:r>
+      <w:r>
+        <w:rPr>
+          <w:rFonts w:ascii="Times New Roman" w:hAnsi="Times New Roman"/>
+          <w:b w:val="0"/>
+          <w:sz w:val="24"/>
+        </w:rPr>
+        <w:t>tintas industriais; pigmentos; processos de fabricação; indústria de transformação; nichos produtivos.</w:t>
       </w:r>
     </w:p>
     <w:p>
@@ -273,27 +287,41 @@
     <w:p>
       <w:pPr>
         <w:pStyle w:val="BlockText"/>
-      </w:pPr>
-      <w:r>
-        <w:t xml:space="preserve">[Same content as Resumo, in English.]</w:t>
+        <w:spacing w:line="360" w:lineRule="auto" w:before="0" w:after="0"/>
+        <w:ind w:firstLine="709"/>
+        <w:jc w:val="both"/>
+      </w:pPr>
+      <w:r>
+        <w:rPr>
+          <w:rFonts w:ascii="Times New Roman" w:hAnsi="Times New Roman"/>
+          <w:b w:val="0"/>
+          <w:sz w:val="24"/>
+        </w:rPr>
+        <w:t>This paper aims to analyze the Brazilian paint and pigment industry from the perspective of the manufacturing industry, identifying productive niches, raw materials, and manufacturing processes characteristic of each segment. The methodology consists of bibliographic and documentary research, based on sectoral data from ABRAFATI, the Brazilian Institute of Geography and Statistics (IBGE/PIA-Empresa), market reports from Grand View Research and Mordor Intelligence, and specialized technical sources. The results indicate that Brazil ranks 4th in the global paint production ranking, with 2.005 billion liters produced in 2025, within a global market valued at USD 211.28 billion in 2024. The sector is structured as an intermediate link between base industries — petrochemical, mining, and fine chemistry — and end-user industries, classified under Division 20 of Brazil's National Classification of Economic Activities (CNAE 2.0). Paint formulation involves four families of raw materials — resins, pigments, solvents, and additives — whose combinations define the productive niches identified: residential, general industrial, automotive, naval, powder coatings, UV/EB curing systems, and specialty and functional paints. Manufacturing processes vary by niche, with emphasis on pigment dispersion in bead mills, extrusion for powder coatings, and photopolymerization for radiation-curing systems. It is concluded that the sector presents high diversification potential, with strategic high-opportunity niches in anticorrosive coatings for the offshore segment, intumescent paints, renewable energy coatings, and waterborne systems, a trend driven by environmental regulations and growing ESG demand.</w:t>
       </w:r>
     </w:p>
     <w:p>
       <w:pPr>
         <w:pStyle w:val="BlockText"/>
+        <w:spacing w:line="360" w:lineRule="auto" w:before="0" w:after="0"/>
+        <w:ind w:firstLine="0"/>
+        <w:jc w:val="both"/>
       </w:pPr>
       <w:r>
         <w:rPr>
+          <w:rFonts w:ascii="Times New Roman" w:hAnsi="Times New Roman"/>
           <w:b/>
-          <w:bCs/>
+          <w:sz w:val="24"/>
         </w:rPr>
-        <w:t xml:space="preserve">Keywords:</w:t>
-      </w:r>
-      <w:r>
-        <w:t xml:space="preserve"> </w:t>
-      </w:r>
-      <w:r>
-        <w:t xml:space="preserve">[keyword 1]; [keyword 2]; [keyword 3]; [keyword 4]; [keyword 5].</w:t>
+        <w:t xml:space="preserve">Keywords: </w:t>
+      </w:r>
+      <w:r>
+        <w:rPr>
+          <w:rFonts w:ascii="Times New Roman" w:hAnsi="Times New Roman"/>
+          <w:b w:val="0"/>
+          <w:sz w:val="24"/>
+        </w:rPr>
+        <w:t>industrial paints; pigments; manufacturing processes; manufacturing industry; productive niches.</w:t>
       </w:r>
     </w:p>
     <w:p>

</xml_diff>